<commit_message>
Deliverable 2: GNS3 Configuration And Verification Files
Uploaded Deliverable 2 for the High Availability Router Project, including the GNS3 project file, Router and Switch running configuration files, ping connectivity test results, VLAN verification screenshots, SSH login proof from Kali Linux, and the Week 2 Status Report. All implementation, connectivity testing, verification, and documentation tasks for Week 2 have been completed and uploaded successfully.
</commit_message>
<xml_diff>
--- a/Week 2 Status Report.docx
+++ b/Week 2 Status Report.docx
@@ -256,17 +256,7 @@
           <w:sz w:val="28"/>
           <w:szCs w:val="28"/>
         </w:rPr>
-        <w:t>Introduction</w:t>
-      </w:r>
-      <w:r>
-        <w:rPr>
-          <w:rFonts w:ascii="Times New Roman" w:hAnsi="Times New Roman" w:cs="Times New Roman"/>
-          <w:b/>
-          <w:bCs/>
-          <w:sz w:val="28"/>
-          <w:szCs w:val="28"/>
-        </w:rPr>
-        <w:t>:</w:t>
+        <w:t>Introduction:</w:t>
       </w:r>
     </w:p>
     <w:p>
@@ -300,17 +290,7 @@
           <w:sz w:val="28"/>
           <w:szCs w:val="28"/>
         </w:rPr>
-        <w:t>Objectives</w:t>
-      </w:r>
-      <w:r>
-        <w:rPr>
-          <w:rFonts w:ascii="Times New Roman" w:hAnsi="Times New Roman" w:cs="Times New Roman"/>
-          <w:b/>
-          <w:bCs/>
-          <w:sz w:val="28"/>
-          <w:szCs w:val="28"/>
-        </w:rPr>
-        <w:t>:</w:t>
+        <w:t>Objectives:</w:t>
       </w:r>
     </w:p>
     <w:p>
@@ -527,40 +507,13 @@
           <w:sz w:val="28"/>
           <w:szCs w:val="28"/>
         </w:rPr>
-        <w:t>Network Topology Implementation</w:t>
-      </w:r>
-      <w:r>
-        <w:rPr>
-          <w:rFonts w:ascii="Times New Roman" w:hAnsi="Times New Roman" w:cs="Times New Roman"/>
-          <w:b/>
-          <w:bCs/>
-          <w:sz w:val="28"/>
-          <w:szCs w:val="28"/>
-        </w:rPr>
-        <w:t>:</w:t>
-      </w:r>
-    </w:p>
-    <w:p>
-      <w:pPr>
-        <w:rPr>
-          <w:rFonts w:ascii="Times New Roman" w:hAnsi="Times New Roman" w:cs="Times New Roman"/>
-        </w:rPr>
-      </w:pPr>
-      <w:r>
-        <w:rPr>
-          <w:rFonts w:ascii="Times New Roman" w:hAnsi="Times New Roman" w:cs="Times New Roman"/>
-        </w:rPr>
-        <w:t>The network topology designed in Week 1 was successfully implemented in GNS3. All required devices including routers, switch, PCs, and Kali Linux virtual machine were added and connected according to the project design.</w:t>
-      </w:r>
-    </w:p>
-    <w:p>
-      <w:pPr>
-        <w:rPr>
-          <w:rFonts w:ascii="Times New Roman" w:hAnsi="Times New Roman" w:cs="Times New Roman"/>
-          <w:b/>
-          <w:bCs/>
-          <w:sz w:val="28"/>
-          <w:szCs w:val="28"/>
+        <w:t>Network Topology Implementation:</w:t>
+      </w:r>
+    </w:p>
+    <w:p>
+      <w:pPr>
+        <w:rPr>
+          <w:rFonts w:ascii="Times New Roman" w:hAnsi="Times New Roman" w:cs="Times New Roman"/>
         </w:rPr>
       </w:pPr>
       <w:r>
@@ -569,18 +522,18 @@
           <w:noProof/>
         </w:rPr>
         <w:drawing>
-          <wp:anchor distT="0" distB="0" distL="114300" distR="114300" simplePos="0" relativeHeight="251658240" behindDoc="0" locked="0" layoutInCell="1" allowOverlap="1" wp14:anchorId="66C87283" wp14:editId="7851FB91">
+          <wp:anchor distT="0" distB="0" distL="114300" distR="114300" simplePos="0" relativeHeight="251678720" behindDoc="0" locked="0" layoutInCell="1" allowOverlap="1" wp14:anchorId="7BC27505" wp14:editId="1D4895C1">
             <wp:simplePos x="0" y="0"/>
             <wp:positionH relativeFrom="column">
-              <wp:posOffset>914400</wp:posOffset>
+              <wp:posOffset>2952750</wp:posOffset>
             </wp:positionH>
             <wp:positionV relativeFrom="paragraph">
-              <wp:posOffset>45720</wp:posOffset>
+              <wp:posOffset>680085</wp:posOffset>
             </wp:positionV>
-            <wp:extent cx="4273550" cy="2463592"/>
-            <wp:effectExtent l="19050" t="19050" r="12700" b="13335"/>
+            <wp:extent cx="3575032" cy="2457450"/>
+            <wp:effectExtent l="19050" t="19050" r="26035" b="19050"/>
             <wp:wrapNone/>
-            <wp:docPr id="1960721379" name="Picture 1"/>
+            <wp:docPr id="1232322269" name="Picture 1"/>
             <wp:cNvGraphicFramePr>
               <a:graphicFrameLocks xmlns:a="http://schemas.openxmlformats.org/drawingml/2006/main" noChangeAspect="1"/>
             </wp:cNvGraphicFramePr>
@@ -588,7 +541,7 @@
               <a:graphicData uri="http://schemas.openxmlformats.org/drawingml/2006/picture">
                 <pic:pic xmlns:pic="http://schemas.openxmlformats.org/drawingml/2006/picture">
                   <pic:nvPicPr>
-                    <pic:cNvPr id="1960721379" name="Picture 1960721379"/>
+                    <pic:cNvPr id="1232322269" name="Picture 1232322269"/>
                     <pic:cNvPicPr/>
                   </pic:nvPicPr>
                   <pic:blipFill>
@@ -606,7 +559,7 @@
                   <pic:spPr>
                     <a:xfrm>
                       <a:off x="0" y="0"/>
-                      <a:ext cx="4277615" cy="2465935"/>
+                      <a:ext cx="3578136" cy="2459583"/>
                     </a:xfrm>
                     <a:prstGeom prst="rect">
                       <a:avLst/>
@@ -629,72 +582,12 @@
           </wp:anchor>
         </w:drawing>
       </w:r>
-    </w:p>
-    <w:p>
-      <w:pPr>
-        <w:rPr>
-          <w:rFonts w:ascii="Times New Roman" w:hAnsi="Times New Roman" w:cs="Times New Roman"/>
-          <w:b/>
-          <w:bCs/>
-          <w:sz w:val="28"/>
-          <w:szCs w:val="28"/>
-        </w:rPr>
-      </w:pPr>
-    </w:p>
-    <w:p>
-      <w:pPr>
-        <w:rPr>
-          <w:rFonts w:ascii="Times New Roman" w:hAnsi="Times New Roman" w:cs="Times New Roman"/>
-          <w:b/>
-          <w:bCs/>
-          <w:sz w:val="28"/>
-          <w:szCs w:val="28"/>
-        </w:rPr>
-      </w:pPr>
-    </w:p>
-    <w:p>
-      <w:pPr>
-        <w:rPr>
-          <w:rFonts w:ascii="Times New Roman" w:hAnsi="Times New Roman" w:cs="Times New Roman"/>
-          <w:b/>
-          <w:bCs/>
-          <w:sz w:val="28"/>
-          <w:szCs w:val="28"/>
-        </w:rPr>
-      </w:pPr>
-    </w:p>
-    <w:p>
-      <w:pPr>
-        <w:rPr>
-          <w:rFonts w:ascii="Times New Roman" w:hAnsi="Times New Roman" w:cs="Times New Roman"/>
-          <w:b/>
-          <w:bCs/>
-          <w:sz w:val="28"/>
-          <w:szCs w:val="28"/>
-        </w:rPr>
-      </w:pPr>
-    </w:p>
-    <w:p>
-      <w:pPr>
-        <w:rPr>
-          <w:rFonts w:ascii="Times New Roman" w:hAnsi="Times New Roman" w:cs="Times New Roman"/>
-          <w:b/>
-          <w:bCs/>
-          <w:sz w:val="28"/>
-          <w:szCs w:val="28"/>
-        </w:rPr>
-      </w:pPr>
-    </w:p>
-    <w:p>
-      <w:pPr>
-        <w:rPr>
-          <w:rFonts w:ascii="Times New Roman" w:hAnsi="Times New Roman" w:cs="Times New Roman"/>
-          <w:b/>
-          <w:bCs/>
-          <w:sz w:val="28"/>
-          <w:szCs w:val="28"/>
-        </w:rPr>
-      </w:pPr>
+      <w:r>
+        <w:rPr>
+          <w:rFonts w:ascii="Times New Roman" w:hAnsi="Times New Roman" w:cs="Times New Roman"/>
+        </w:rPr>
+        <w:t>The network topology designed in Week 1 was successfully implemented in GNS3. All required devices including routers, switch, PCs, and Kali Linux virtual machine were added and connected according to the project design.</w:t>
+      </w:r>
     </w:p>
     <w:p>
       <w:pPr>
@@ -712,7 +605,150 @@
           <w:noProof/>
         </w:rPr>
         <w:drawing>
-          <wp:anchor distT="0" distB="0" distL="114300" distR="114300" simplePos="0" relativeHeight="251659264" behindDoc="0" locked="0" layoutInCell="1" allowOverlap="1" wp14:anchorId="6441157F" wp14:editId="5B0D4CE3">
+          <wp:anchor distT="0" distB="0" distL="114300" distR="114300" simplePos="0" relativeHeight="251658240" behindDoc="0" locked="0" layoutInCell="1" allowOverlap="1" wp14:anchorId="66C87283" wp14:editId="64353AAE">
+            <wp:simplePos x="0" y="0"/>
+            <wp:positionH relativeFrom="column">
+              <wp:posOffset>-844549</wp:posOffset>
+            </wp:positionH>
+            <wp:positionV relativeFrom="paragraph">
+              <wp:posOffset>1270</wp:posOffset>
+            </wp:positionV>
+            <wp:extent cx="3638550" cy="2463165"/>
+            <wp:effectExtent l="19050" t="19050" r="19050" b="13335"/>
+            <wp:wrapNone/>
+            <wp:docPr id="1960721379" name="Picture 1"/>
+            <wp:cNvGraphicFramePr>
+              <a:graphicFrameLocks xmlns:a="http://schemas.openxmlformats.org/drawingml/2006/main" noChangeAspect="1"/>
+            </wp:cNvGraphicFramePr>
+            <a:graphic xmlns:a="http://schemas.openxmlformats.org/drawingml/2006/main">
+              <a:graphicData uri="http://schemas.openxmlformats.org/drawingml/2006/picture">
+                <pic:pic xmlns:pic="http://schemas.openxmlformats.org/drawingml/2006/picture">
+                  <pic:nvPicPr>
+                    <pic:cNvPr id="1960721379" name="Picture 1960721379"/>
+                    <pic:cNvPicPr/>
+                  </pic:nvPicPr>
+                  <pic:blipFill>
+                    <a:blip r:embed="rId9">
+                      <a:extLst>
+                        <a:ext uri="{28A0092B-C50C-407E-A947-70E740481C1C}">
+                          <a14:useLocalDpi xmlns:a14="http://schemas.microsoft.com/office/drawing/2010/main" val="0"/>
+                        </a:ext>
+                      </a:extLst>
+                    </a:blip>
+                    <a:stretch>
+                      <a:fillRect/>
+                    </a:stretch>
+                  </pic:blipFill>
+                  <pic:spPr>
+                    <a:xfrm>
+                      <a:off x="0" y="0"/>
+                      <a:ext cx="3639181" cy="2463592"/>
+                    </a:xfrm>
+                    <a:prstGeom prst="rect">
+                      <a:avLst/>
+                    </a:prstGeom>
+                    <a:ln>
+                      <a:solidFill>
+                        <a:schemeClr val="tx1"/>
+                      </a:solidFill>
+                    </a:ln>
+                  </pic:spPr>
+                </pic:pic>
+              </a:graphicData>
+            </a:graphic>
+            <wp14:sizeRelH relativeFrom="margin">
+              <wp14:pctWidth>0</wp14:pctWidth>
+            </wp14:sizeRelH>
+            <wp14:sizeRelV relativeFrom="margin">
+              <wp14:pctHeight>0</wp14:pctHeight>
+            </wp14:sizeRelV>
+          </wp:anchor>
+        </w:drawing>
+      </w:r>
+    </w:p>
+    <w:p>
+      <w:pPr>
+        <w:rPr>
+          <w:rFonts w:ascii="Times New Roman" w:hAnsi="Times New Roman" w:cs="Times New Roman"/>
+          <w:b/>
+          <w:bCs/>
+          <w:sz w:val="28"/>
+          <w:szCs w:val="28"/>
+        </w:rPr>
+      </w:pPr>
+    </w:p>
+    <w:p>
+      <w:pPr>
+        <w:rPr>
+          <w:rFonts w:ascii="Times New Roman" w:hAnsi="Times New Roman" w:cs="Times New Roman"/>
+          <w:b/>
+          <w:bCs/>
+          <w:sz w:val="28"/>
+          <w:szCs w:val="28"/>
+        </w:rPr>
+      </w:pPr>
+    </w:p>
+    <w:p>
+      <w:pPr>
+        <w:rPr>
+          <w:rFonts w:ascii="Times New Roman" w:hAnsi="Times New Roman" w:cs="Times New Roman"/>
+          <w:b/>
+          <w:bCs/>
+          <w:sz w:val="28"/>
+          <w:szCs w:val="28"/>
+        </w:rPr>
+      </w:pPr>
+    </w:p>
+    <w:p>
+      <w:pPr>
+        <w:rPr>
+          <w:rFonts w:ascii="Times New Roman" w:hAnsi="Times New Roman" w:cs="Times New Roman"/>
+          <w:b/>
+          <w:bCs/>
+          <w:sz w:val="28"/>
+          <w:szCs w:val="28"/>
+        </w:rPr>
+      </w:pPr>
+    </w:p>
+    <w:p>
+      <w:pPr>
+        <w:rPr>
+          <w:rFonts w:ascii="Times New Roman" w:hAnsi="Times New Roman" w:cs="Times New Roman"/>
+          <w:b/>
+          <w:bCs/>
+          <w:sz w:val="28"/>
+          <w:szCs w:val="28"/>
+        </w:rPr>
+      </w:pPr>
+    </w:p>
+    <w:p>
+      <w:pPr>
+        <w:rPr>
+          <w:rFonts w:ascii="Times New Roman" w:hAnsi="Times New Roman" w:cs="Times New Roman"/>
+          <w:b/>
+          <w:bCs/>
+          <w:sz w:val="28"/>
+          <w:szCs w:val="28"/>
+        </w:rPr>
+      </w:pPr>
+    </w:p>
+    <w:p>
+      <w:pPr>
+        <w:rPr>
+          <w:rFonts w:ascii="Times New Roman" w:hAnsi="Times New Roman" w:cs="Times New Roman"/>
+          <w:b/>
+          <w:bCs/>
+          <w:sz w:val="28"/>
+          <w:szCs w:val="28"/>
+        </w:rPr>
+      </w:pPr>
+      <w:r>
+        <w:rPr>
+          <w:rFonts w:ascii="Times New Roman" w:hAnsi="Times New Roman" w:cs="Times New Roman"/>
+          <w:noProof/>
+        </w:rPr>
+        <w:drawing>
+          <wp:anchor distT="0" distB="0" distL="114300" distR="114300" simplePos="0" relativeHeight="251659264" behindDoc="0" locked="0" layoutInCell="1" allowOverlap="1" wp14:anchorId="6441157F" wp14:editId="5E2ADD4B">
             <wp:simplePos x="0" y="0"/>
             <wp:positionH relativeFrom="column">
               <wp:posOffset>2641600</wp:posOffset>
@@ -735,7 +771,7 @@
                     <pic:cNvPicPr/>
                   </pic:nvPicPr>
                   <pic:blipFill>
-                    <a:blip r:embed="rId9" cstate="print">
+                    <a:blip r:embed="rId10" cstate="print">
                       <a:extLst>
                         <a:ext uri="{28A0092B-C50C-407E-A947-70E740481C1C}">
                           <a14:useLocalDpi xmlns:a14="http://schemas.microsoft.com/office/drawing/2010/main" val="0"/>
@@ -786,17 +822,7 @@
           <w:sz w:val="28"/>
           <w:szCs w:val="28"/>
         </w:rPr>
-        <w:t>Device Configuration</w:t>
-      </w:r>
-      <w:r>
-        <w:rPr>
-          <w:rFonts w:ascii="Times New Roman" w:hAnsi="Times New Roman" w:cs="Times New Roman"/>
-          <w:b/>
-          <w:bCs/>
-          <w:sz w:val="28"/>
-          <w:szCs w:val="28"/>
-        </w:rPr>
-        <w:t>:</w:t>
+        <w:t>Device Configuration:</w:t>
       </w:r>
     </w:p>
     <w:p>
@@ -821,6 +847,7 @@
       <w:r>
         <w:rPr>
           <w:rFonts w:ascii="Times New Roman" w:hAnsi="Times New Roman" w:cs="Times New Roman"/>
+          <w:noProof/>
         </w:rPr>
         <w:drawing>
           <wp:anchor distT="0" distB="0" distL="114300" distR="114300" simplePos="0" relativeHeight="251660288" behindDoc="0" locked="0" layoutInCell="1" allowOverlap="1" wp14:anchorId="673FE670" wp14:editId="241EADBD">
@@ -846,7 +873,7 @@
                     <pic:cNvPicPr/>
                   </pic:nvPicPr>
                   <pic:blipFill>
-                    <a:blip r:embed="rId10">
+                    <a:blip r:embed="rId11">
                       <a:extLst>
                         <a:ext uri="{28A0092B-C50C-407E-A947-70E740481C1C}">
                           <a14:useLocalDpi xmlns:a14="http://schemas.microsoft.com/office/drawing/2010/main" val="0"/>
@@ -909,6 +936,7 @@
       <w:r>
         <w:rPr>
           <w:rFonts w:ascii="Times New Roman" w:hAnsi="Times New Roman" w:cs="Times New Roman"/>
+          <w:noProof/>
         </w:rPr>
         <w:drawing>
           <wp:anchor distT="0" distB="0" distL="114300" distR="114300" simplePos="0" relativeHeight="251661312" behindDoc="0" locked="0" layoutInCell="1" allowOverlap="1" wp14:anchorId="2E56379A" wp14:editId="7CB90D77">
@@ -934,7 +962,7 @@
                     <pic:cNvPicPr/>
                   </pic:nvPicPr>
                   <pic:blipFill>
-                    <a:blip r:embed="rId11">
+                    <a:blip r:embed="rId12">
                       <a:extLst>
                         <a:ext uri="{28A0092B-C50C-407E-A947-70E740481C1C}">
                           <a14:useLocalDpi xmlns:a14="http://schemas.microsoft.com/office/drawing/2010/main" val="0"/>
@@ -978,6 +1006,7 @@
           <w:rFonts w:ascii="Times New Roman" w:hAnsi="Times New Roman" w:cs="Times New Roman"/>
           <w:b/>
           <w:bCs/>
+          <w:noProof/>
           <w:sz w:val="28"/>
           <w:szCs w:val="28"/>
         </w:rPr>
@@ -1005,7 +1034,7 @@
                     <pic:cNvPicPr/>
                   </pic:nvPicPr>
                   <pic:blipFill>
-                    <a:blip r:embed="rId12">
+                    <a:blip r:embed="rId13">
                       <a:extLst>
                         <a:ext uri="{28A0092B-C50C-407E-A947-70E740481C1C}">
                           <a14:useLocalDpi xmlns:a14="http://schemas.microsoft.com/office/drawing/2010/main" val="0"/>
@@ -1102,7 +1131,7 @@
         </w:rPr>
         <w:lastRenderedPageBreak/>
         <w:drawing>
-          <wp:anchor distT="0" distB="0" distL="114300" distR="114300" simplePos="0" relativeHeight="251668480" behindDoc="0" locked="0" layoutInCell="1" allowOverlap="1" wp14:anchorId="06CD913C" wp14:editId="122B8479">
+          <wp:anchor distT="0" distB="0" distL="114300" distR="114300" simplePos="0" relativeHeight="251668480" behindDoc="0" locked="0" layoutInCell="1" allowOverlap="1" wp14:anchorId="06CD913C" wp14:editId="5A03C85F">
             <wp:simplePos x="0" y="0"/>
             <wp:positionH relativeFrom="margin">
               <wp:posOffset>3492500</wp:posOffset>
@@ -1125,7 +1154,7 @@
                     <pic:cNvPicPr/>
                   </pic:nvPicPr>
                   <pic:blipFill>
-                    <a:blip r:embed="rId13" cstate="print">
+                    <a:blip r:embed="rId14" cstate="print">
                       <a:extLst>
                         <a:ext uri="{28A0092B-C50C-407E-A947-70E740481C1C}">
                           <a14:useLocalDpi xmlns:a14="http://schemas.microsoft.com/office/drawing/2010/main" val="0"/>
@@ -1167,7 +1196,7 @@
           <w:szCs w:val="28"/>
         </w:rPr>
         <w:drawing>
-          <wp:anchor distT="0" distB="0" distL="114300" distR="114300" simplePos="0" relativeHeight="251667456" behindDoc="0" locked="0" layoutInCell="1" allowOverlap="1" wp14:anchorId="43BF45D6" wp14:editId="1C45184E">
+          <wp:anchor distT="0" distB="0" distL="114300" distR="114300" simplePos="0" relativeHeight="251667456" behindDoc="0" locked="0" layoutInCell="1" allowOverlap="1" wp14:anchorId="43BF45D6" wp14:editId="5F4AF772">
             <wp:simplePos x="0" y="0"/>
             <wp:positionH relativeFrom="margin">
               <wp:posOffset>-361950</wp:posOffset>
@@ -1190,7 +1219,7 @@
                     <pic:cNvPicPr/>
                   </pic:nvPicPr>
                   <pic:blipFill>
-                    <a:blip r:embed="rId14" cstate="print">
+                    <a:blip r:embed="rId15" cstate="print">
                       <a:extLst>
                         <a:ext uri="{28A0092B-C50C-407E-A947-70E740481C1C}">
                           <a14:useLocalDpi xmlns:a14="http://schemas.microsoft.com/office/drawing/2010/main" val="0"/>
@@ -1330,7 +1359,7 @@
           <w:szCs w:val="28"/>
         </w:rPr>
         <w:drawing>
-          <wp:anchor distT="0" distB="0" distL="114300" distR="114300" simplePos="0" relativeHeight="251671552" behindDoc="0" locked="0" layoutInCell="1" allowOverlap="1" wp14:anchorId="75AA10CD" wp14:editId="41BFC58B">
+          <wp:anchor distT="0" distB="0" distL="114300" distR="114300" simplePos="0" relativeHeight="251671552" behindDoc="0" locked="0" layoutInCell="1" allowOverlap="1" wp14:anchorId="75AA10CD" wp14:editId="65F4115D">
             <wp:simplePos x="0" y="0"/>
             <wp:positionH relativeFrom="column">
               <wp:posOffset>3073400</wp:posOffset>
@@ -1353,7 +1382,7 @@
                     <pic:cNvPicPr/>
                   </pic:nvPicPr>
                   <pic:blipFill>
-                    <a:blip r:embed="rId15" cstate="print">
+                    <a:blip r:embed="rId16" cstate="print">
                       <a:extLst>
                         <a:ext uri="{28A0092B-C50C-407E-A947-70E740481C1C}">
                           <a14:useLocalDpi xmlns:a14="http://schemas.microsoft.com/office/drawing/2010/main" val="0"/>
@@ -1395,7 +1424,7 @@
           <w:szCs w:val="28"/>
         </w:rPr>
         <w:drawing>
-          <wp:anchor distT="0" distB="0" distL="114300" distR="114300" simplePos="0" relativeHeight="251670528" behindDoc="0" locked="0" layoutInCell="1" allowOverlap="1" wp14:anchorId="1D06050F" wp14:editId="614AF7D3">
+          <wp:anchor distT="0" distB="0" distL="114300" distR="114300" simplePos="0" relativeHeight="251670528" behindDoc="0" locked="0" layoutInCell="1" allowOverlap="1" wp14:anchorId="1D06050F" wp14:editId="04A5C144">
             <wp:simplePos x="0" y="0"/>
             <wp:positionH relativeFrom="margin">
               <wp:posOffset>-361950</wp:posOffset>
@@ -1418,7 +1447,7 @@
                     <pic:cNvPicPr/>
                   </pic:nvPicPr>
                   <pic:blipFill>
-                    <a:blip r:embed="rId16" cstate="print">
+                    <a:blip r:embed="rId17" cstate="print">
                       <a:extLst>
                         <a:ext uri="{28A0092B-C50C-407E-A947-70E740481C1C}">
                           <a14:useLocalDpi xmlns:a14="http://schemas.microsoft.com/office/drawing/2010/main" val="0"/>
@@ -1570,7 +1599,7 @@
                     <pic:cNvPicPr/>
                   </pic:nvPicPr>
                   <pic:blipFill>
-                    <a:blip r:embed="rId17">
+                    <a:blip r:embed="rId18">
                       <a:extLst>
                         <a:ext uri="{28A0092B-C50C-407E-A947-70E740481C1C}">
                           <a14:useLocalDpi xmlns:a14="http://schemas.microsoft.com/office/drawing/2010/main" val="0"/>
@@ -1610,17 +1639,7 @@
           <w:sz w:val="28"/>
           <w:szCs w:val="28"/>
         </w:rPr>
-        <w:t>IP Addressing Configuration</w:t>
-      </w:r>
-      <w:r>
-        <w:rPr>
-          <w:rFonts w:ascii="Times New Roman" w:hAnsi="Times New Roman" w:cs="Times New Roman"/>
-          <w:b/>
-          <w:bCs/>
-          <w:sz w:val="28"/>
-          <w:szCs w:val="28"/>
-        </w:rPr>
-        <w:t>:</w:t>
+        <w:t>IP Addressing Configuration:</w:t>
       </w:r>
     </w:p>
     <w:p>
@@ -1658,7 +1677,7 @@
                     <pic:cNvPicPr/>
                   </pic:nvPicPr>
                   <pic:blipFill>
-                    <a:blip r:embed="rId18">
+                    <a:blip r:embed="rId19">
                       <a:extLst>
                         <a:ext uri="{28A0092B-C50C-407E-A947-70E740481C1C}">
                           <a14:useLocalDpi xmlns:a14="http://schemas.microsoft.com/office/drawing/2010/main" val="0"/>
@@ -1740,7 +1759,7 @@
                     <pic:cNvPicPr/>
                   </pic:nvPicPr>
                   <pic:blipFill>
-                    <a:blip r:embed="rId19">
+                    <a:blip r:embed="rId20">
                       <a:extLst>
                         <a:ext uri="{28A0092B-C50C-407E-A947-70E740481C1C}">
                           <a14:useLocalDpi xmlns:a14="http://schemas.microsoft.com/office/drawing/2010/main" val="0"/>
@@ -1880,7 +1899,7 @@
                     <pic:cNvPicPr/>
                   </pic:nvPicPr>
                   <pic:blipFill>
-                    <a:blip r:embed="rId20">
+                    <a:blip r:embed="rId21">
                       <a:extLst>
                         <a:ext uri="{28A0092B-C50C-407E-A947-70E740481C1C}">
                           <a14:useLocalDpi xmlns:a14="http://schemas.microsoft.com/office/drawing/2010/main" val="0"/>
@@ -1979,7 +1998,7 @@
                     <pic:cNvPicPr/>
                   </pic:nvPicPr>
                   <pic:blipFill>
-                    <a:blip r:embed="rId21" cstate="print">
+                    <a:blip r:embed="rId22" cstate="print">
                       <a:extLst>
                         <a:ext uri="{28A0092B-C50C-407E-A947-70E740481C1C}">
                           <a14:useLocalDpi xmlns:a14="http://schemas.microsoft.com/office/drawing/2010/main" val="0"/>
@@ -2019,17 +2038,7 @@
           <w:sz w:val="28"/>
           <w:szCs w:val="28"/>
         </w:rPr>
-        <w:t>Connectivity Testing</w:t>
-      </w:r>
-      <w:r>
-        <w:rPr>
-          <w:rFonts w:ascii="Times New Roman" w:hAnsi="Times New Roman" w:cs="Times New Roman"/>
-          <w:b/>
-          <w:bCs/>
-          <w:sz w:val="28"/>
-          <w:szCs w:val="28"/>
-        </w:rPr>
-        <w:t>:</w:t>
+        <w:t>Connectivity Testing:</w:t>
       </w:r>
     </w:p>
     <w:p>
@@ -2071,7 +2080,7 @@
                     <pic:cNvPicPr/>
                   </pic:nvPicPr>
                   <pic:blipFill>
-                    <a:blip r:embed="rId22" cstate="print">
+                    <a:blip r:embed="rId23" cstate="print">
                       <a:extLst>
                         <a:ext uri="{28A0092B-C50C-407E-A947-70E740481C1C}">
                           <a14:useLocalDpi xmlns:a14="http://schemas.microsoft.com/office/drawing/2010/main" val="0"/>
@@ -2186,7 +2195,7 @@
                     <pic:cNvPicPr/>
                   </pic:nvPicPr>
                   <pic:blipFill>
-                    <a:blip r:embed="rId23" cstate="print">
+                    <a:blip r:embed="rId24" cstate="print">
                       <a:extLst>
                         <a:ext uri="{28A0092B-C50C-407E-A947-70E740481C1C}">
                           <a14:useLocalDpi xmlns:a14="http://schemas.microsoft.com/office/drawing/2010/main" val="0"/>
@@ -2262,7 +2271,7 @@
                     <pic:cNvPicPr/>
                   </pic:nvPicPr>
                   <pic:blipFill>
-                    <a:blip r:embed="rId24" cstate="print">
+                    <a:blip r:embed="rId25" cstate="print">
                       <a:extLst>
                         <a:ext uri="{28A0092B-C50C-407E-A947-70E740481C1C}">
                           <a14:useLocalDpi xmlns:a14="http://schemas.microsoft.com/office/drawing/2010/main" val="0"/>
@@ -2393,7 +2402,7 @@
                     <pic:cNvPicPr/>
                   </pic:nvPicPr>
                   <pic:blipFill>
-                    <a:blip r:embed="rId25" cstate="print">
+                    <a:blip r:embed="rId26" cstate="print">
                       <a:extLst>
                         <a:ext uri="{28A0092B-C50C-407E-A947-70E740481C1C}">
                           <a14:useLocalDpi xmlns:a14="http://schemas.microsoft.com/office/drawing/2010/main" val="0"/>
@@ -2566,7 +2575,7 @@
                     <pic:cNvPicPr/>
                   </pic:nvPicPr>
                   <pic:blipFill>
-                    <a:blip r:embed="rId26" cstate="print">
+                    <a:blip r:embed="rId27" cstate="print">
                       <a:extLst>
                         <a:ext uri="{28A0092B-C50C-407E-A947-70E740481C1C}">
                           <a14:useLocalDpi xmlns:a14="http://schemas.microsoft.com/office/drawing/2010/main" val="0"/>
@@ -2606,17 +2615,7 @@
           <w:sz w:val="28"/>
           <w:szCs w:val="28"/>
         </w:rPr>
-        <w:t>VLAN Verification</w:t>
-      </w:r>
-      <w:r>
-        <w:rPr>
-          <w:rFonts w:ascii="Times New Roman" w:hAnsi="Times New Roman" w:cs="Times New Roman"/>
-          <w:b/>
-          <w:bCs/>
-          <w:sz w:val="28"/>
-          <w:szCs w:val="28"/>
-        </w:rPr>
-        <w:t>:</w:t>
+        <w:t>VLAN Verification:</w:t>
       </w:r>
     </w:p>
     <w:p>
@@ -2699,7 +2698,7 @@
                     <pic:cNvPicPr/>
                   </pic:nvPicPr>
                   <pic:blipFill>
-                    <a:blip r:embed="rId27" cstate="print">
+                    <a:blip r:embed="rId28" cstate="print">
                       <a:extLst>
                         <a:ext uri="{28A0092B-C50C-407E-A947-70E740481C1C}">
                           <a14:useLocalDpi xmlns:a14="http://schemas.microsoft.com/office/drawing/2010/main" val="0"/>
@@ -2739,17 +2738,7 @@
           <w:sz w:val="28"/>
           <w:szCs w:val="28"/>
         </w:rPr>
-        <w:t>SSH Login Verification</w:t>
-      </w:r>
-      <w:r>
-        <w:rPr>
-          <w:rFonts w:ascii="Times New Roman" w:hAnsi="Times New Roman" w:cs="Times New Roman"/>
-          <w:b/>
-          <w:bCs/>
-          <w:sz w:val="28"/>
-          <w:szCs w:val="28"/>
-        </w:rPr>
-        <w:t>:</w:t>
+        <w:t>SSH Login Verification:</w:t>
       </w:r>
     </w:p>
     <w:p>
@@ -2892,17 +2881,7 @@
           <w:sz w:val="28"/>
           <w:szCs w:val="28"/>
         </w:rPr>
-        <w:t>GitHub Repository Update</w:t>
-      </w:r>
-      <w:r>
-        <w:rPr>
-          <w:rFonts w:ascii="Times New Roman" w:hAnsi="Times New Roman" w:cs="Times New Roman"/>
-          <w:b/>
-          <w:bCs/>
-          <w:sz w:val="28"/>
-          <w:szCs w:val="28"/>
-        </w:rPr>
-        <w:t>:</w:t>
+        <w:t>GitHub Repository Update:</w:t>
       </w:r>
     </w:p>
     <w:p>
@@ -2945,7 +2924,7 @@
           <w:rFonts w:ascii="Times New Roman" w:hAnsi="Times New Roman" w:cs="Times New Roman"/>
         </w:rPr>
       </w:pPr>
-      <w:hyperlink r:id="rId28" w:history="1">
+      <w:hyperlink r:id="rId29" w:history="1">
         <w:r>
           <w:rPr>
             <w:rStyle w:val="Hyperlink"/>
@@ -2973,17 +2952,7 @@
           <w:sz w:val="28"/>
           <w:szCs w:val="28"/>
         </w:rPr>
-        <w:t>Challenges Encountered</w:t>
-      </w:r>
-      <w:r>
-        <w:rPr>
-          <w:rFonts w:ascii="Times New Roman" w:hAnsi="Times New Roman" w:cs="Times New Roman"/>
-          <w:b/>
-          <w:bCs/>
-          <w:sz w:val="28"/>
-          <w:szCs w:val="28"/>
-        </w:rPr>
-        <w:t>:</w:t>
+        <w:t>Challenges Encountered:</w:t>
       </w:r>
     </w:p>
     <w:p>
@@ -3061,17 +3030,7 @@
           <w:sz w:val="28"/>
           <w:szCs w:val="28"/>
         </w:rPr>
-        <w:t>Solutions Applied</w:t>
-      </w:r>
-      <w:r>
-        <w:rPr>
-          <w:rFonts w:ascii="Times New Roman" w:hAnsi="Times New Roman" w:cs="Times New Roman"/>
-          <w:b/>
-          <w:bCs/>
-          <w:sz w:val="28"/>
-          <w:szCs w:val="28"/>
-        </w:rPr>
-        <w:t>:</w:t>
+        <w:t>Solutions Applied:</w:t>
       </w:r>
     </w:p>
     <w:p>
@@ -3168,17 +3127,7 @@
           <w:sz w:val="28"/>
           <w:szCs w:val="28"/>
         </w:rPr>
-        <w:t>Conclusion</w:t>
-      </w:r>
-      <w:r>
-        <w:rPr>
-          <w:rFonts w:ascii="Times New Roman" w:hAnsi="Times New Roman" w:cs="Times New Roman"/>
-          <w:b/>
-          <w:bCs/>
-          <w:sz w:val="28"/>
-          <w:szCs w:val="28"/>
-        </w:rPr>
-        <w:t>:</w:t>
+        <w:t>Conclusion:</w:t>
       </w:r>
     </w:p>
     <w:p>

</xml_diff>